<commit_message>
docs: add final SalesFlow architecture and journeys
</commit_message>
<xml_diff>
--- a/PRD_ N8N Sales AI Agent - Updated 2026-07-15.docx
+++ b/PRD_ N8N Sales AI Agent - Updated 2026-07-15.docx
@@ -20,7 +20,7 @@
         <w:rPr>
           <w:rtl w:val="0"/>
         </w:rPr>
-        <w:t xml:space="preserve">Product Requirements Document (PRD): N8N Sales AI Agent</w:t>
+        <w:t>Product Requirements Document (PRD): N8N Sales AI Agent</w:t>
       </w:r>
     </w:p>
     <w:p>
@@ -40,6 +40,884 @@
         <w:rPr>
           <w:rtl w:val="0"/>
         </w:rPr>
+      </w:r>
+    </w:p>
+    <w:p>
+      <w:pPr>
+        <w:pStyle w:val="Heading2"/>
+      </w:pPr>
+      <w:r>
+        <w:t>Revision Guide - Original Concept vs 15 July 2026 Baseline</w:t>
+      </w:r>
+    </w:p>
+    <w:p>
+      <w:r>
+        <w:rPr>
+          <w:b/>
+        </w:rPr>
+        <w:t xml:space="preserve">Old version: </w:t>
+      </w:r>
+      <w:r>
+        <w:t>"PRD_ N8N Sales AI Agent.docx" is the original concept note. Sections 1-6 in this edition preserve that early product intent for comparison.</w:t>
+      </w:r>
+    </w:p>
+    <w:p>
+      <w:r>
+        <w:rPr>
+          <w:b/>
+        </w:rPr>
+        <w:t xml:space="preserve">Current version: </w:t>
+      </w:r>
+      <w:r>
+        <w:t>This 15 July 2026 edition adds the verified synthetic-local implementation status, corrects the assistant's authority boundary, and identifies the external decisions still blocking production.</w:t>
+      </w:r>
+    </w:p>
+    <w:p>
+      <w:r>
+        <w:rPr>
+          <w:b/>
+        </w:rPr>
+        <w:t xml:space="preserve">Executive takeaway: </w:t>
+      </w:r>
+      <w:r>
+        <w:t>The project moved from an aspirational "autonomous sales closer" concept to a policy-bound qualification and Handoff system. The local technical baseline is verified; live customer operation is not approved.</w:t>
+      </w:r>
+    </w:p>
+    <w:tbl>
+      <w:tblPr>
+        <w:tblW w:type="auto" w:w="0"/>
+        <w:jc w:val="center"/>
+        <w:tblLayout w:type="fixed"/>
+        <w:tblLook w:firstColumn="1" w:firstRow="1" w:lastColumn="0" w:lastRow="0" w:noHBand="0" w:noVBand="1" w:val="04A0"/>
+        <w:tblBorders>
+          <w:top w:val="single" w:sz="4" w:color="B7C9D6"/>
+          <w:left w:val="single" w:sz="4" w:color="B7C9D6"/>
+          <w:bottom w:val="single" w:sz="4" w:color="B7C9D6"/>
+          <w:right w:val="single" w:sz="4" w:color="B7C9D6"/>
+          <w:insideH w:val="single" w:sz="4" w:color="B7C9D6"/>
+          <w:insideV w:val="single" w:sz="4" w:color="B7C9D6"/>
+        </w:tblBorders>
+      </w:tblPr>
+      <w:tblGrid>
+        <w:gridCol w:w="2340"/>
+        <w:gridCol w:w="2340"/>
+        <w:gridCol w:w="2340"/>
+        <w:gridCol w:w="2340"/>
+      </w:tblGrid>
+      <w:tr>
+        <w:trPr>
+          <w:tblHeader w:val="true"/>
+        </w:trPr>
+        <w:tc>
+          <w:tcPr>
+            <w:tcW w:type="dxa" w:w="1512"/>
+            <w:vAlign w:val="center"/>
+            <w:shd w:fill="D9EAF7"/>
+          </w:tcPr>
+          <w:p>
+            <w:pPr>
+              <w:jc w:val="center"/>
+            </w:pPr>
+            <w:r>
+              <w:rPr>
+                <w:b/>
+                <w:sz w:val="18"/>
+              </w:rPr>
+              <w:t>Area</w:t>
+            </w:r>
+          </w:p>
+        </w:tc>
+        <w:tc>
+          <w:tcPr>
+            <w:tcW w:type="dxa" w:w="2376"/>
+            <w:vAlign w:val="center"/>
+            <w:shd w:fill="D9EAF7"/>
+          </w:tcPr>
+          <w:p>
+            <w:pPr>
+              <w:jc w:val="center"/>
+            </w:pPr>
+            <w:r>
+              <w:rPr>
+                <w:b/>
+                <w:sz w:val="18"/>
+              </w:rPr>
+              <w:t>Original concept</w:t>
+            </w:r>
+          </w:p>
+        </w:tc>
+        <w:tc>
+          <w:tcPr>
+            <w:tcW w:type="dxa" w:w="2808"/>
+            <w:vAlign w:val="center"/>
+            <w:shd w:fill="D9EAF7"/>
+          </w:tcPr>
+          <w:p>
+            <w:pPr>
+              <w:jc w:val="center"/>
+            </w:pPr>
+            <w:r>
+              <w:rPr>
+                <w:b/>
+                <w:sz w:val="18"/>
+              </w:rPr>
+              <w:t>15 July 2026 update</w:t>
+            </w:r>
+          </w:p>
+        </w:tc>
+        <w:tc>
+          <w:tcPr>
+            <w:tcW w:type="dxa" w:w="2664"/>
+            <w:vAlign w:val="center"/>
+            <w:shd w:fill="D9EAF7"/>
+          </w:tcPr>
+          <w:p>
+            <w:pPr>
+              <w:jc w:val="center"/>
+            </w:pPr>
+            <w:r>
+              <w:rPr>
+                <w:b/>
+                <w:sz w:val="18"/>
+              </w:rPr>
+              <w:t>Practical meaning</w:t>
+            </w:r>
+          </w:p>
+        </w:tc>
+      </w:tr>
+      <w:tr>
+        <w:tc>
+          <w:tcPr>
+            <w:tcW w:type="dxa" w:w="1512"/>
+            <w:vAlign w:val="top"/>
+          </w:tcPr>
+          <w:p>
+            <w:pPr>
+              <w:spacing w:after="0"/>
+            </w:pPr>
+            <w:r>
+              <w:rPr>
+                <w:b/>
+                <w:sz w:val="17"/>
+              </w:rPr>
+              <w:t>Document purpose</w:t>
+            </w:r>
+          </w:p>
+        </w:tc>
+        <w:tc>
+          <w:tcPr>
+            <w:tcW w:type="dxa" w:w="2376"/>
+            <w:vAlign w:val="top"/>
+          </w:tcPr>
+          <w:p>
+            <w:pPr>
+              <w:spacing w:after="0"/>
+            </w:pPr>
+            <w:r>
+              <w:rPr>
+                <w:sz w:val="17"/>
+              </w:rPr>
+              <w:t>Desired product concept and feature list.</w:t>
+            </w:r>
+          </w:p>
+        </w:tc>
+        <w:tc>
+          <w:tcPr>
+            <w:tcW w:type="dxa" w:w="2808"/>
+            <w:vAlign w:val="top"/>
+          </w:tcPr>
+          <w:p>
+            <w:pPr>
+              <w:spacing w:after="0"/>
+            </w:pPr>
+            <w:r>
+              <w:rPr>
+                <w:sz w:val="17"/>
+              </w:rPr>
+              <w:t>Current decision baseline tied to repository evidence.</w:t>
+            </w:r>
+          </w:p>
+        </w:tc>
+        <w:tc>
+          <w:tcPr>
+            <w:tcW w:type="dxa" w:w="2664"/>
+            <w:vAlign w:val="top"/>
+          </w:tcPr>
+          <w:p>
+            <w:pPr>
+              <w:spacing w:after="0"/>
+            </w:pPr>
+            <w:r>
+              <w:rPr>
+                <w:sz w:val="17"/>
+              </w:rPr>
+              <w:t>Use the old text for intent; use the new baseline for scope, authority, and release decisions.</w:t>
+            </w:r>
+          </w:p>
+        </w:tc>
+      </w:tr>
+      <w:tr>
+        <w:tc>
+          <w:tcPr>
+            <w:tcW w:type="dxa" w:w="1512"/>
+            <w:vAlign w:val="top"/>
+          </w:tcPr>
+          <w:p>
+            <w:pPr>
+              <w:spacing w:after="0"/>
+            </w:pPr>
+            <w:r>
+              <w:rPr>
+                <w:b/>
+                <w:sz w:val="17"/>
+              </w:rPr>
+              <w:t>AI authority</w:t>
+            </w:r>
+          </w:p>
+        </w:tc>
+        <w:tc>
+          <w:tcPr>
+            <w:tcW w:type="dxa" w:w="2376"/>
+            <w:vAlign w:val="top"/>
+          </w:tcPr>
+          <w:p>
+            <w:pPr>
+              <w:spacing w:after="0"/>
+            </w:pPr>
+            <w:r>
+              <w:rPr>
+                <w:sz w:val="17"/>
+              </w:rPr>
+              <w:t>The AI persuasively negotiates and steers toward management targets.</w:t>
+            </w:r>
+          </w:p>
+        </w:tc>
+        <w:tc>
+          <w:tcPr>
+            <w:tcW w:type="dxa" w:w="2808"/>
+            <w:vAlign w:val="top"/>
+          </w:tcPr>
+          <w:p>
+            <w:pPr>
+              <w:spacing w:after="0"/>
+            </w:pPr>
+            <w:r>
+              <w:rPr>
+                <w:sz w:val="17"/>
+              </w:rPr>
+              <w:t>The LLM drafts language and proposes typed intent; deterministic Sales Policy and humans control commercial commitments.</w:t>
+            </w:r>
+          </w:p>
+        </w:tc>
+        <w:tc>
+          <w:tcPr>
+            <w:tcW w:type="dxa" w:w="2664"/>
+            <w:vAlign w:val="top"/>
+          </w:tcPr>
+          <w:p>
+            <w:pPr>
+              <w:spacing w:after="0"/>
+            </w:pPr>
+            <w:r>
+              <w:rPr>
+                <w:sz w:val="17"/>
+              </w:rPr>
+              <w:t>No autonomous discount, scope, SLA, warranty, contract-term, or binding-offer decisions.</w:t>
+            </w:r>
+          </w:p>
+        </w:tc>
+      </w:tr>
+      <w:tr>
+        <w:tc>
+          <w:tcPr>
+            <w:tcW w:type="dxa" w:w="1512"/>
+            <w:vAlign w:val="top"/>
+          </w:tcPr>
+          <w:p>
+            <w:pPr>
+              <w:spacing w:after="0"/>
+            </w:pPr>
+            <w:r>
+              <w:rPr>
+                <w:b/>
+                <w:sz w:val="17"/>
+              </w:rPr>
+              <w:t>Deal outcome</w:t>
+            </w:r>
+          </w:p>
+        </w:tc>
+        <w:tc>
+          <w:tcPr>
+            <w:tcW w:type="dxa" w:w="2376"/>
+            <w:vAlign w:val="top"/>
+          </w:tcPr>
+          <w:p>
+            <w:pPr>
+              <w:spacing w:after="0"/>
+            </w:pPr>
+            <w:r>
+              <w:rPr>
+                <w:sz w:val="17"/>
+              </w:rPr>
+              <w:t>The AI may infer "Deal Closed" or that the customer is convinced.</w:t>
+            </w:r>
+          </w:p>
+        </w:tc>
+        <w:tc>
+          <w:tcPr>
+            <w:tcW w:type="dxa" w:w="2808"/>
+            <w:vAlign w:val="top"/>
+          </w:tcPr>
+          <w:p>
+            <w:pPr>
+              <w:spacing w:after="0"/>
+            </w:pPr>
+            <w:r>
+              <w:rPr>
+                <w:sz w:val="17"/>
+              </w:rPr>
+              <w:t>Buying intent becomes ready_for_handoff; only an authorized human or CRM may record approval or closed_won.</w:t>
+            </w:r>
+          </w:p>
+        </w:tc>
+        <w:tc>
+          <w:tcPr>
+            <w:tcW w:type="dxa" w:w="2664"/>
+            <w:vAlign w:val="top"/>
+          </w:tcPr>
+          <w:p>
+            <w:pPr>
+              <w:spacing w:after="0"/>
+            </w:pPr>
+            <w:r>
+              <w:rPr>
+                <w:sz w:val="17"/>
+              </w:rPr>
+              <w:t>The assistant qualifies and prepares evidence; it does not close the legal or commercial transaction.</w:t>
+            </w:r>
+          </w:p>
+        </w:tc>
+      </w:tr>
+      <w:tr>
+        <w:tc>
+          <w:tcPr>
+            <w:tcW w:type="dxa" w:w="1512"/>
+            <w:vAlign w:val="top"/>
+          </w:tcPr>
+          <w:p>
+            <w:pPr>
+              <w:spacing w:after="0"/>
+            </w:pPr>
+            <w:r>
+              <w:rPr>
+                <w:b/>
+                <w:sz w:val="17"/>
+              </w:rPr>
+              <w:t>Identity and memory</w:t>
+            </w:r>
+          </w:p>
+        </w:tc>
+        <w:tc>
+          <w:tcPr>
+            <w:tcW w:type="dxa" w:w="2376"/>
+            <w:vAlign w:val="top"/>
+          </w:tcPr>
+          <w:p>
+            <w:pPr>
+              <w:spacing w:after="0"/>
+            </w:pPr>
+            <w:r>
+              <w:rPr>
+                <w:sz w:val="17"/>
+              </w:rPr>
+              <w:t>Conversation history is maintained per phone number.</w:t>
+            </w:r>
+          </w:p>
+        </w:tc>
+        <w:tc>
+          <w:tcPr>
+            <w:tcW w:type="dxa" w:w="2808"/>
+            <w:vAlign w:val="top"/>
+          </w:tcPr>
+          <w:p>
+            <w:pPr>
+              <w:spacing w:after="0"/>
+            </w:pPr>
+            <w:r>
+              <w:rPr>
+                <w:sz w:val="17"/>
+              </w:rPr>
+              <w:t>Internal Contact and Conversation IDs own scope and history; the phone number is only a channel identifier.</w:t>
+            </w:r>
+          </w:p>
+        </w:tc>
+        <w:tc>
+          <w:tcPr>
+            <w:tcW w:type="dxa" w:w="2664"/>
+            <w:vAlign w:val="top"/>
+          </w:tcPr>
+          <w:p>
+            <w:pPr>
+              <w:spacing w:after="0"/>
+            </w:pPr>
+            <w:r>
+              <w:rPr>
+                <w:sz w:val="17"/>
+              </w:rPr>
+              <w:t>Identity, authorization, retention, and deletion no longer depend on a phone number alone.</w:t>
+            </w:r>
+          </w:p>
+        </w:tc>
+      </w:tr>
+      <w:tr>
+        <w:tc>
+          <w:tcPr>
+            <w:tcW w:type="dxa" w:w="1512"/>
+            <w:vAlign w:val="top"/>
+          </w:tcPr>
+          <w:p>
+            <w:pPr>
+              <w:spacing w:after="0"/>
+            </w:pPr>
+            <w:r>
+              <w:rPr>
+                <w:b/>
+                <w:sz w:val="17"/>
+              </w:rPr>
+              <w:t>Follow-Up design</w:t>
+            </w:r>
+          </w:p>
+        </w:tc>
+        <w:tc>
+          <w:tcPr>
+            <w:tcW w:type="dxa" w:w="2376"/>
+            <w:vAlign w:val="top"/>
+          </w:tcPr>
+          <w:p>
+            <w:pPr>
+              <w:spacing w:after="0"/>
+            </w:pPr>
+            <w:r>
+              <w:rPr>
+                <w:sz w:val="17"/>
+              </w:rPr>
+              <w:t>N8N Wait nodes or Cron timers trigger a contextual message.</w:t>
+            </w:r>
+          </w:p>
+        </w:tc>
+        <w:tc>
+          <w:tcPr>
+            <w:tcW w:type="dxa" w:w="2808"/>
+            <w:vAlign w:val="top"/>
+          </w:tcPr>
+          <w:p>
+            <w:pPr>
+              <w:spacing w:after="0"/>
+            </w:pPr>
+            <w:r>
+              <w:rPr>
+                <w:sz w:val="17"/>
+              </w:rPr>
+              <w:t>Durable UTC jobs recheck consent, opt-out, ownership, timing, frequency, campaign state, and WhatsApp eligibility before every send.</w:t>
+            </w:r>
+          </w:p>
+        </w:tc>
+        <w:tc>
+          <w:tcPr>
+            <w:tcW w:type="dxa" w:w="2664"/>
+            <w:vAlign w:val="top"/>
+          </w:tcPr>
+          <w:p>
+            <w:pPr>
+              <w:spacing w:after="0"/>
+            </w:pPr>
+            <w:r>
+              <w:rPr>
+                <w:sz w:val="17"/>
+              </w:rPr>
+              <w:t>A scheduled job is not permission to send; policy is revalidated at dispatch time.</w:t>
+            </w:r>
+          </w:p>
+        </w:tc>
+      </w:tr>
+      <w:tr>
+        <w:tc>
+          <w:tcPr>
+            <w:tcW w:type="dxa" w:w="1512"/>
+            <w:vAlign w:val="top"/>
+          </w:tcPr>
+          <w:p>
+            <w:pPr>
+              <w:spacing w:after="0"/>
+            </w:pPr>
+            <w:r>
+              <w:rPr>
+                <w:b/>
+                <w:sz w:val="17"/>
+              </w:rPr>
+              <w:t>Human Handoff</w:t>
+            </w:r>
+          </w:p>
+        </w:tc>
+        <w:tc>
+          <w:tcPr>
+            <w:tcW w:type="dxa" w:w="2376"/>
+            <w:vAlign w:val="top"/>
+          </w:tcPr>
+          <w:p>
+            <w:pPr>
+              <w:spacing w:after="0"/>
+            </w:pPr>
+            <w:r>
+              <w:rPr>
+                <w:sz w:val="17"/>
+              </w:rPr>
+              <w:t>The representative mainly enters at the final signing stage.</w:t>
+            </w:r>
+          </w:p>
+        </w:tc>
+        <w:tc>
+          <w:tcPr>
+            <w:tcW w:type="dxa" w:w="2808"/>
+            <w:vAlign w:val="top"/>
+          </w:tcPr>
+          <w:p>
+            <w:pPr>
+              <w:spacing w:after="0"/>
+            </w:pPr>
+            <w:r>
+              <w:rPr>
+                <w:sz w:val="17"/>
+              </w:rPr>
+              <w:t>The customer or policy may request Handoff at any stage; Human-Owned blocks automated replies and Follow-Ups.</w:t>
+            </w:r>
+          </w:p>
+        </w:tc>
+        <w:tc>
+          <w:tcPr>
+            <w:tcW w:type="dxa" w:w="2664"/>
+            <w:vAlign w:val="top"/>
+          </w:tcPr>
+          <w:p>
+            <w:pPr>
+              <w:spacing w:after="0"/>
+            </w:pPr>
+            <w:r>
+              <w:rPr>
+                <w:sz w:val="17"/>
+              </w:rPr>
+              <w:t>Safety and customer choice take priority over automation or conversion targets.</w:t>
+            </w:r>
+          </w:p>
+        </w:tc>
+      </w:tr>
+      <w:tr>
+        <w:tc>
+          <w:tcPr>
+            <w:tcW w:type="dxa" w:w="1512"/>
+            <w:vAlign w:val="top"/>
+          </w:tcPr>
+          <w:p>
+            <w:pPr>
+              <w:spacing w:after="0"/>
+            </w:pPr>
+            <w:r>
+              <w:rPr>
+                <w:b/>
+                <w:sz w:val="17"/>
+              </w:rPr>
+              <w:t>Business controls</w:t>
+            </w:r>
+          </w:p>
+        </w:tc>
+        <w:tc>
+          <w:tcPr>
+            <w:tcW w:type="dxa" w:w="2376"/>
+            <w:vAlign w:val="top"/>
+          </w:tcPr>
+          <w:p>
+            <w:pPr>
+              <w:spacing w:after="0"/>
+            </w:pPr>
+            <w:r>
+              <w:rPr>
+                <w:sz w:val="17"/>
+              </w:rPr>
+              <w:t>OKRs and KPIs are injected into the model prompt.</w:t>
+            </w:r>
+          </w:p>
+        </w:tc>
+        <w:tc>
+          <w:tcPr>
+            <w:tcW w:type="dxa" w:w="2808"/>
+            <w:vAlign w:val="top"/>
+          </w:tcPr>
+          <w:p>
+            <w:pPr>
+              <w:spacing w:after="0"/>
+            </w:pPr>
+            <w:r>
+              <w:rPr>
+                <w:sz w:val="17"/>
+              </w:rPr>
+              <w:t>Versioned Product Knowledge and Sales Policy provide approved facts, offers, prohibitions, and escalation rules.</w:t>
+            </w:r>
+          </w:p>
+        </w:tc>
+        <w:tc>
+          <w:tcPr>
+            <w:tcW w:type="dxa" w:w="2664"/>
+            <w:vAlign w:val="top"/>
+          </w:tcPr>
+          <w:p>
+            <w:pPr>
+              <w:spacing w:after="0"/>
+            </w:pPr>
+            <w:r>
+              <w:rPr>
+                <w:sz w:val="17"/>
+              </w:rPr>
+              <w:t>Prompts guide drafting; deterministic controls enforce authority.</w:t>
+            </w:r>
+          </w:p>
+        </w:tc>
+      </w:tr>
+      <w:tr>
+        <w:tc>
+          <w:tcPr>
+            <w:tcW w:type="dxa" w:w="1512"/>
+            <w:vAlign w:val="top"/>
+          </w:tcPr>
+          <w:p>
+            <w:pPr>
+              <w:spacing w:after="0"/>
+            </w:pPr>
+            <w:r>
+              <w:rPr>
+                <w:b/>
+                <w:sz w:val="17"/>
+              </w:rPr>
+              <w:t>Implementation state</w:t>
+            </w:r>
+          </w:p>
+        </w:tc>
+        <w:tc>
+          <w:tcPr>
+            <w:tcW w:type="dxa" w:w="2376"/>
+            <w:vAlign w:val="top"/>
+          </w:tcPr>
+          <w:p>
+            <w:pPr>
+              <w:spacing w:after="0"/>
+            </w:pPr>
+            <w:r>
+              <w:rPr>
+                <w:sz w:val="17"/>
+              </w:rPr>
+              <w:t>Architecture and features are requirements to be built.</w:t>
+            </w:r>
+          </w:p>
+        </w:tc>
+        <w:tc>
+          <w:tcPr>
+            <w:tcW w:type="dxa" w:w="2808"/>
+            <w:vAlign w:val="top"/>
+          </w:tcPr>
+          <w:p>
+            <w:pPr>
+              <w:spacing w:after="0"/>
+            </w:pPr>
+            <w:r>
+              <w:rPr>
+                <w:sz w:val="17"/>
+              </w:rPr>
+              <w:t>Seven native-node workflows, PostgreSQL state, ten typed contracts, and a one-command verification harness are delivered locally.</w:t>
+            </w:r>
+          </w:p>
+        </w:tc>
+        <w:tc>
+          <w:tcPr>
+            <w:tcW w:type="dxa" w:w="2664"/>
+            <w:vAlign w:val="top"/>
+          </w:tcPr>
+          <w:p>
+            <w:pPr>
+              <w:spacing w:after="0"/>
+            </w:pPr>
+            <w:r>
+              <w:rPr>
+                <w:sz w:val="17"/>
+              </w:rPr>
+              <w:t>The new edition distinguishes implemented components from planned behavior.</w:t>
+            </w:r>
+          </w:p>
+        </w:tc>
+      </w:tr>
+      <w:tr>
+        <w:tc>
+          <w:tcPr>
+            <w:tcW w:type="dxa" w:w="1512"/>
+            <w:vAlign w:val="top"/>
+          </w:tcPr>
+          <w:p>
+            <w:pPr>
+              <w:spacing w:after="0"/>
+            </w:pPr>
+            <w:r>
+              <w:rPr>
+                <w:b/>
+                <w:sz w:val="17"/>
+              </w:rPr>
+              <w:t>Evidence and NFRs</w:t>
+            </w:r>
+          </w:p>
+        </w:tc>
+        <w:tc>
+          <w:tcPr>
+            <w:tcW w:type="dxa" w:w="2376"/>
+            <w:vAlign w:val="top"/>
+          </w:tcPr>
+          <w:p>
+            <w:pPr>
+              <w:spacing w:after="0"/>
+            </w:pPr>
+            <w:r>
+              <w:rPr>
+                <w:sz w:val="17"/>
+              </w:rPr>
+              <w:t>Three-to-five-second response and 99.9% availability appear as requirements.</w:t>
+            </w:r>
+          </w:p>
+        </w:tc>
+        <w:tc>
+          <w:tcPr>
+            <w:tcW w:type="dxa" w:w="2808"/>
+            <w:vAlign w:val="top"/>
+          </w:tcPr>
+          <w:p>
+            <w:pPr>
+              <w:spacing w:after="0"/>
+            </w:pPr>
+            <w:r>
+              <w:rPr>
+                <w:sz w:val="17"/>
+              </w:rPr>
+              <w:t>S01-S26 plus concurrency and recovery checks pass locally; production latency, load, uptime, RTO, and RPO are not proven.</w:t>
+            </w:r>
+          </w:p>
+        </w:tc>
+        <w:tc>
+          <w:tcPr>
+            <w:tcW w:type="dxa" w:w="2664"/>
+            <w:vAlign w:val="top"/>
+          </w:tcPr>
+          <w:p>
+            <w:pPr>
+              <w:spacing w:after="0"/>
+            </w:pPr>
+            <w:r>
+              <w:rPr>
+                <w:sz w:val="17"/>
+              </w:rPr>
+              <w:t>Targets remain targets until measured in the approved production-like environment.</w:t>
+            </w:r>
+          </w:p>
+        </w:tc>
+      </w:tr>
+      <w:tr>
+        <w:tc>
+          <w:tcPr>
+            <w:tcW w:type="dxa" w:w="1512"/>
+            <w:vAlign w:val="top"/>
+          </w:tcPr>
+          <w:p>
+            <w:pPr>
+              <w:spacing w:after="0"/>
+            </w:pPr>
+            <w:r>
+              <w:rPr>
+                <w:b/>
+                <w:sz w:val="17"/>
+              </w:rPr>
+              <w:t>Release status</w:t>
+            </w:r>
+          </w:p>
+        </w:tc>
+        <w:tc>
+          <w:tcPr>
+            <w:tcW w:type="dxa" w:w="2376"/>
+            <w:vAlign w:val="top"/>
+          </w:tcPr>
+          <w:p>
+            <w:pPr>
+              <w:spacing w:after="0"/>
+            </w:pPr>
+            <w:r>
+              <w:rPr>
+                <w:sz w:val="17"/>
+              </w:rPr>
+              <w:t>The concept can read like a near-complete automated product.</w:t>
+            </w:r>
+          </w:p>
+        </w:tc>
+        <w:tc>
+          <w:tcPr>
+            <w:tcW w:type="dxa" w:w="2808"/>
+            <w:vAlign w:val="top"/>
+          </w:tcPr>
+          <w:p>
+            <w:pPr>
+              <w:spacing w:after="0"/>
+            </w:pPr>
+            <w:r>
+              <w:rPr>
+                <w:sz w:val="17"/>
+              </w:rPr>
+              <w:t>The release manifest keeps livePromotionAllowed = false; Meta, LLM, CRM, managed database, content, legal/privacy, and Release Owner gates remain open.</w:t>
+            </w:r>
+          </w:p>
+        </w:tc>
+        <w:tc>
+          <w:tcPr>
+            <w:tcW w:type="dxa" w:w="2664"/>
+            <w:vAlign w:val="top"/>
+          </w:tcPr>
+          <w:p>
+            <w:pPr>
+              <w:spacing w:after="0"/>
+            </w:pPr>
+            <w:r>
+              <w:rPr>
+                <w:sz w:val="17"/>
+              </w:rPr>
+              <w:t>No live promotion or paid production claim is authorized.</w:t>
+            </w:r>
+          </w:p>
+        </w:tc>
+      </w:tr>
+    </w:tbl>
+    <w:p>
+      <w:pPr>
+        <w:pStyle w:val="Heading3"/>
+      </w:pPr>
+      <w:r>
+        <w:t>What Has Not Changed</w:t>
+      </w:r>
+    </w:p>
+    <w:p>
+      <w:r>
+        <w:t>N8N remains the orchestration platform; WhatsApp remains the customer channel; the system still supports approved answers, qualification, eligible Follow-Ups, measurable funnel performance, and evidence-rich human Handoff. The update narrows authority and strengthens operational controls rather than abandoning the original business objective.</w:t>
+      </w:r>
+    </w:p>
+    <w:p>
+      <w:r>
+        <w:rPr>
+          <w:b/>
+        </w:rPr>
+        <w:t xml:space="preserve">Precedence: </w:t>
+      </w:r>
+      <w:r>
+        <w:t>For implementation, testing, customer commitments, and launch approval, this revision guide and Section 7 override conflicting language in Sections 1-6. The canonical repository PRD and release evidence remain the detailed governing sources.</w:t>
       </w:r>
     </w:p>
     <w:p>
@@ -59,7 +937,21 @@
         <w:rPr>
           <w:rtl w:val="0"/>
         </w:rPr>
-        <w:t xml:space="preserve">1. Executive Summary &amp; Objective</w:t>
+        <w:t>1. Executive Summary &amp; Objective</w:t>
+      </w:r>
+    </w:p>
+    <w:p>
+      <w:r>
+        <w:rPr>
+          <w:b/>
+        </w:rPr>
+        <w:t xml:space="preserve">Legacy-section note: </w:t>
+      </w:r>
+      <w:r>
+        <w:rPr>
+          <w:i/>
+        </w:rPr>
+        <w:t>Sections 1-6 below are retained from the original concept note. Read them as desired business intent, subject to the stricter controls and evidence boundaries in the revision guide and Section 7.</w:t>
       </w:r>
     </w:p>
     <w:p>
@@ -86,7 +978,7 @@
           <w:bCs w:val="1"/>
           <w:rtl w:val="0"/>
         </w:rPr>
-        <w:t xml:space="preserve">N8N</w:t>
+        <w:t>N8N</w:t>
       </w:r>
       <w:r>
         <w:rPr>
@@ -131,7 +1023,7 @@
         <w:rPr>
           <w:rtl w:val="0"/>
         </w:rPr>
-        <w:t xml:space="preserve">2. Target Audience &amp; User Personas</w:t>
+        <w:t>2. Target Audience &amp; User Personas</w:t>
       </w:r>
     </w:p>
     <w:p>
@@ -156,7 +1048,7 @@
           <w:bCs w:val="1"/>
           <w:rtl w:val="0"/>
         </w:rPr>
-        <w:t xml:space="preserve">The Customer (End-User):</w:t>
+        <w:t>The Customer (End-User):</w:t>
       </w:r>
       <w:r>
         <w:rPr>
@@ -187,7 +1079,7 @@
           <w:bCs w:val="1"/>
           <w:rtl w:val="0"/>
         </w:rPr>
-        <w:t xml:space="preserve">The Sales Manager (Admin/Stakeholder):</w:t>
+        <w:t>The Sales Manager (Admin/Stakeholder):</w:t>
       </w:r>
       <w:r>
         <w:rPr>
@@ -218,7 +1110,7 @@
           <w:bCs w:val="1"/>
           <w:rtl w:val="0"/>
         </w:rPr>
-        <w:t xml:space="preserve">The Human Sales Representative:</w:t>
+        <w:t>The Human Sales Representative:</w:t>
       </w:r>
       <w:r>
         <w:rPr>
@@ -264,7 +1156,7 @@
         <w:rPr>
           <w:rtl w:val="0"/>
         </w:rPr>
-        <w:t xml:space="preserve">3. Product Features &amp; Requirements</w:t>
+        <w:t>3. Product Features &amp; Requirements</w:t>
       </w:r>
     </w:p>
     <w:p>
@@ -285,7 +1177,7 @@
         <w:rPr>
           <w:rtl w:val="0"/>
         </w:rPr>
-        <w:t xml:space="preserve">3.1 WhatsApp Business API Integration via N8N</w:t>
+        <w:t>3.1 WhatsApp Business API Integration via N8N</w:t>
       </w:r>
     </w:p>
     <w:p>
@@ -310,7 +1202,7 @@
           <w:bCs w:val="1"/>
           <w:rtl w:val="0"/>
         </w:rPr>
-        <w:t xml:space="preserve">Requirement:</w:t>
+        <w:t>Requirement:</w:t>
       </w:r>
       <w:r>
         <w:rPr>
@@ -341,7 +1233,7 @@
           <w:bCs w:val="1"/>
           <w:rtl w:val="0"/>
         </w:rPr>
-        <w:t xml:space="preserve">Details:</w:t>
+        <w:t>Details:</w:t>
       </w:r>
       <w:r>
         <w:rPr>
@@ -367,7 +1259,7 @@
         <w:rPr>
           <w:rtl w:val="0"/>
         </w:rPr>
-        <w:t xml:space="preserve">3.2 OKRs &amp; KPIs Ingestion &amp; Routing System</w:t>
+        <w:t>3.2 OKRs &amp; KPIs Ingestion &amp; Routing System</w:t>
       </w:r>
     </w:p>
     <w:p>
@@ -392,7 +1284,7 @@
           <w:bCs w:val="1"/>
           <w:rtl w:val="0"/>
         </w:rPr>
-        <w:t xml:space="preserve">Requirement:</w:t>
+        <w:t>Requirement:</w:t>
       </w:r>
       <w:r>
         <w:rPr>
@@ -423,7 +1315,7 @@
           <w:bCs w:val="1"/>
           <w:rtl w:val="0"/>
         </w:rPr>
-        <w:t xml:space="preserve">Details:</w:t>
+        <w:t>Details:</w:t>
       </w:r>
       <w:r>
         <w:rPr>
@@ -449,7 +1341,7 @@
         <w:rPr>
           <w:rtl w:val="0"/>
         </w:rPr>
-        <w:t xml:space="preserve">3.3 AI Persuasion &amp; Negotiation Engine</w:t>
+        <w:t>3.3 AI Persuasion &amp; Negotiation Engine</w:t>
       </w:r>
     </w:p>
     <w:p>
@@ -474,7 +1366,7 @@
           <w:bCs w:val="1"/>
           <w:rtl w:val="0"/>
         </w:rPr>
-        <w:t xml:space="preserve">Requirement:</w:t>
+        <w:t>Requirement:</w:t>
       </w:r>
       <w:r>
         <w:rPr>
@@ -505,7 +1397,7 @@
           <w:bCs w:val="1"/>
           <w:rtl w:val="0"/>
         </w:rPr>
-        <w:t xml:space="preserve">Details:</w:t>
+        <w:t>Details:</w:t>
       </w:r>
     </w:p>
     <w:p>
@@ -528,7 +1420,7 @@
         <w:rPr>
           <w:rtl w:val="0"/>
         </w:rPr>
-        <w:t xml:space="preserve">Integration with LLMs (e.g., Gemma 4, Qwen 2.7, or Gemini 1.5 Pro) via N8N specialized nodes.</w:t>
+        <w:t>Integration with LLMs (e.g., Gemma 4, Qwen 2.7, or Gemini 1.5 Pro) via N8N specialized nodes.</w:t>
       </w:r>
     </w:p>
     <w:p>
@@ -551,7 +1443,7 @@
         <w:rPr>
           <w:rtl w:val="0"/>
         </w:rPr>
-        <w:t xml:space="preserve">Maintain a continuous conversation history (Memory Component) per user phone number to ensure context continuity across multiple days.</w:t>
+        <w:t>Maintain a continuous conversation history (Memory Component) per user phone number to ensure context continuity across multiple days.</w:t>
       </w:r>
     </w:p>
     <w:p>
@@ -574,7 +1466,7 @@
         <w:rPr>
           <w:rtl w:val="0"/>
         </w:rPr>
-        <w:t xml:space="preserve">Implement semantic routing to identify customer intent (e.g., asking a question, raising an objection regarding price, or agreeing to terms).</w:t>
+        <w:t>Implement semantic routing to identify customer intent (e.g., asking a question, raising an objection regarding price, or agreeing to terms).</w:t>
       </w:r>
     </w:p>
     <w:p>
@@ -594,7 +1486,7 @@
         <w:rPr>
           <w:rtl w:val="0"/>
         </w:rPr>
-        <w:t xml:space="preserve">3.4 Automated Follow-Up System</w:t>
+        <w:t>3.4 Automated Follow-Up System</w:t>
       </w:r>
     </w:p>
     <w:p>
@@ -619,7 +1511,7 @@
           <w:bCs w:val="1"/>
           <w:rtl w:val="0"/>
         </w:rPr>
-        <w:t xml:space="preserve">Requirement:</w:t>
+        <w:t>Requirement:</w:t>
       </w:r>
       <w:r>
         <w:rPr>
@@ -650,7 +1542,7 @@
           <w:bCs w:val="1"/>
           <w:rtl w:val="0"/>
         </w:rPr>
-        <w:t xml:space="preserve">Details:</w:t>
+        <w:t>Details:</w:t>
       </w:r>
       <w:r>
         <w:rPr>
@@ -676,7 +1568,7 @@
         <w:rPr>
           <w:rtl w:val="0"/>
         </w:rPr>
-        <w:t xml:space="preserve">3.5 Deal Closure &amp; Hand-off Notification System</w:t>
+        <w:t>3.5 Deal Closure &amp; Hand-off Notification System</w:t>
       </w:r>
     </w:p>
     <w:p>
@@ -701,7 +1593,7 @@
           <w:bCs w:val="1"/>
           <w:rtl w:val="0"/>
         </w:rPr>
-        <w:t xml:space="preserve">Requirement:</w:t>
+        <w:t>Requirement:</w:t>
       </w:r>
       <w:r>
         <w:rPr>
@@ -732,7 +1624,7 @@
           <w:bCs w:val="1"/>
           <w:rtl w:val="0"/>
         </w:rPr>
-        <w:t xml:space="preserve">Details:</w:t>
+        <w:t>Details:</w:t>
       </w:r>
       <w:r>
         <w:rPr>
@@ -777,7 +1669,7 @@
         <w:rPr>
           <w:rtl w:val="0"/>
         </w:rPr>
-        <w:t xml:space="preserve">4. System Architecture &amp; Data Flow</w:t>
+        <w:t>4. System Architecture &amp; Data Flow</w:t>
       </w:r>
     </w:p>
     <w:p>
@@ -796,7 +1688,7 @@
         <w:rPr>
           <w:rtl w:val="0"/>
         </w:rPr>
-        <w:t xml:space="preserve">The standard operational workflow in N8N will follow this sequence:</w:t>
+        <w:t>The standard operational workflow in N8N will follow this sequence:</w:t>
       </w:r>
     </w:p>
     <w:p>
@@ -821,7 +1713,7 @@
           <w:bCs w:val="1"/>
           <w:rtl w:val="0"/>
         </w:rPr>
-        <w:t xml:space="preserve">Trigger:</w:t>
+        <w:t>Trigger:</w:t>
       </w:r>
       <w:r>
         <w:rPr>
@@ -852,7 +1744,7 @@
           <w:bCs w:val="1"/>
           <w:rtl w:val="0"/>
         </w:rPr>
-        <w:t xml:space="preserve">Pre-processing:</w:t>
+        <w:t>Pre-processing:</w:t>
       </w:r>
       <w:r>
         <w:rPr>
@@ -883,7 +1775,7 @@
           <w:bCs w:val="1"/>
           <w:rtl w:val="0"/>
         </w:rPr>
-        <w:t xml:space="preserve">Context Injection:</w:t>
+        <w:t>Context Injection:</w:t>
       </w:r>
       <w:r>
         <w:rPr>
@@ -914,7 +1806,7 @@
           <w:bCs w:val="1"/>
           <w:rtl w:val="0"/>
         </w:rPr>
-        <w:t xml:space="preserve">AI Processing:</w:t>
+        <w:t>AI Processing:</w:t>
       </w:r>
       <w:r>
         <w:rPr>
@@ -945,7 +1837,7 @@
           <w:bCs w:val="1"/>
           <w:rtl w:val="0"/>
         </w:rPr>
-        <w:t xml:space="preserve">Intent Action:</w:t>
+        <w:t>Intent Action:</w:t>
       </w:r>
       <w:r>
         <w:rPr>
@@ -976,7 +1868,7 @@
           <w:bCs w:val="1"/>
           <w:rtl w:val="0"/>
         </w:rPr>
-        <w:t xml:space="preserve">Wait State:</w:t>
+        <w:t>Wait State:</w:t>
       </w:r>
       <w:r>
         <w:rPr>
@@ -1018,38 +1910,6 @@
       </w:pPr>
       <w:r>
         <w:rPr/>
-        <w:drawing>
-          <wp:inline distB="114300" distT="114300" distL="114300" distR="114300">
-            <wp:extent cx="5943600" cy="3238500"/>
-            <wp:effectExtent b="0" l="0" r="0" t="0"/>
-            <wp:docPr id="1" name="image1.png"/>
-            <a:graphic>
-              <a:graphicData uri="http://schemas.openxmlformats.org/drawingml/2006/picture">
-                <pic:pic>
-                  <pic:nvPicPr>
-                    <pic:cNvPr id="0" name="image1.png"/>
-                    <pic:cNvPicPr preferRelativeResize="0"/>
-                  </pic:nvPicPr>
-                  <pic:blipFill>
-                    <a:blip r:embed="rId6"/>
-                    <a:srcRect b="0" l="0" r="0" t="0"/>
-                    <a:stretch>
-                      <a:fillRect/>
-                    </a:stretch>
-                  </pic:blipFill>
-                  <pic:spPr>
-                    <a:xfrm>
-                      <a:off x="0" y="0"/>
-                      <a:ext cx="5943600" cy="3238500"/>
-                    </a:xfrm>
-                    <a:prstGeom prst="rect"/>
-                    <a:ln/>
-                  </pic:spPr>
-                </pic:pic>
-              </a:graphicData>
-            </a:graphic>
-          </wp:inline>
-        </w:drawing>
       </w:r>
       <w:r>
         <w:rPr>
@@ -1074,7 +1934,7 @@
         <w:rPr>
           <w:rtl w:val="0"/>
         </w:rPr>
-        <w:t xml:space="preserve">5. Non-Functional Requirements</w:t>
+        <w:t>5. Non-Functional Requirements</w:t>
       </w:r>
     </w:p>
     <w:tbl>
@@ -1140,7 +2000,7 @@
                 <w:bCs w:val="1"/>
                 <w:rtl w:val="0"/>
               </w:rPr>
-              <w:t xml:space="preserve">Requirement</w:t>
+              <w:t>Requirement</w:t>
             </w:r>
           </w:p>
         </w:tc>
@@ -1176,7 +2036,7 @@
                 <w:bCs w:val="1"/>
                 <w:rtl w:val="0"/>
               </w:rPr>
-              <w:t xml:space="preserve">Description</w:t>
+              <w:t>Description</w:t>
             </w:r>
           </w:p>
         </w:tc>
@@ -1218,7 +2078,7 @@
                 <w:bCs w:val="1"/>
                 <w:rtl w:val="0"/>
               </w:rPr>
-              <w:t xml:space="preserve">Latency &amp; Performance</w:t>
+              <w:t>Latency &amp; Performance</w:t>
             </w:r>
           </w:p>
         </w:tc>
@@ -1249,7 +2109,7 @@
               <w:rPr>
                 <w:rtl w:val="0"/>
               </w:rPr>
-              <w:t xml:space="preserve">The system must process the incoming webhook, query the LLM, and dispatch the WhatsApp response within 3-5 seconds to maintain a natural conversational flow.</w:t>
+              <w:t>The system must process the incoming webhook, query the LLM, and dispatch the WhatsApp response within 3-5 seconds to maintain a natural conversational flow.</w:t>
             </w:r>
           </w:p>
         </w:tc>
@@ -1291,7 +2151,7 @@
                 <w:bCs w:val="1"/>
                 <w:rtl w:val="0"/>
               </w:rPr>
-              <w:t xml:space="preserve">Availability &amp; Scalability</w:t>
+              <w:t>Availability &amp; Scalability</w:t>
             </w:r>
           </w:p>
         </w:tc>
@@ -1322,7 +2182,7 @@
               <w:rPr>
                 <w:rtl w:val="0"/>
               </w:rPr>
-              <w:t xml:space="preserve">The N8N instance must maintain 99.9% uptime. It must be configured to handle concurrent webhook executions during high-volume marketing campaigns.</w:t>
+              <w:t>The N8N instance must maintain 99.9% uptime. It must be configured to handle concurrent webhook executions during high-volume marketing campaigns.</w:t>
             </w:r>
           </w:p>
         </w:tc>
@@ -1364,7 +2224,7 @@
                 <w:bCs w:val="1"/>
                 <w:rtl w:val="0"/>
               </w:rPr>
-              <w:t xml:space="preserve">Security &amp; Privacy</w:t>
+              <w:t>Security &amp; Privacy</w:t>
             </w:r>
           </w:p>
         </w:tc>
@@ -1395,7 +2255,7 @@
               <w:rPr>
                 <w:rtl w:val="0"/>
               </w:rPr>
-              <w:t xml:space="preserve">Sensitive Personally Identifiable Information (PII) must be handled securely and, where possible, masked before being sent to external LLM providers.</w:t>
+              <w:t>Sensitive Personally Identifiable Information (PII) must be handled securely and, where possible, masked before being sent to external LLM providers.</w:t>
             </w:r>
           </w:p>
         </w:tc>
@@ -1437,7 +2297,7 @@
         <w:rPr>
           <w:rtl w:val="0"/>
         </w:rPr>
-        <w:t xml:space="preserve">6. Success Metrics (KPIs for the AI Agent)</w:t>
+        <w:t>6. Success Metrics (KPIs for the AI Agent)</w:t>
       </w:r>
     </w:p>
     <w:p>
@@ -1462,7 +2322,7 @@
           <w:bCs w:val="1"/>
           <w:rtl w:val="0"/>
         </w:rPr>
-        <w:t xml:space="preserve">Lead Conversion Rate:</w:t>
+        <w:t>Lead Conversion Rate:</w:t>
       </w:r>
       <w:r>
         <w:rPr>
@@ -1493,7 +2353,7 @@
           <w:bCs w:val="1"/>
           <w:rtl w:val="0"/>
         </w:rPr>
-        <w:t xml:space="preserve">Average Handling Time:</w:t>
+        <w:t>Average Handling Time:</w:t>
       </w:r>
       <w:r>
         <w:rPr>
@@ -1524,7 +2384,7 @@
           <w:bCs w:val="1"/>
           <w:rtl w:val="0"/>
         </w:rPr>
-        <w:t xml:space="preserve">Follow-up Revival Rate:</w:t>
+        <w:t>Follow-up Revival Rate:</w:t>
       </w:r>
       <w:r>
         <w:rPr>
@@ -1555,7 +2415,7 @@
           <w:bCs w:val="1"/>
           <w:rtl w:val="0"/>
         </w:rPr>
-        <w:t xml:space="preserve">Human Intervention Rate:</w:t>
+        <w:t>Human Intervention Rate:</w:t>
       </w:r>
       <w:r>
         <w:rPr>
@@ -1565,16 +2425,14 @@
       </w:r>
     </w:p>
     <w:p>
-      <w:r>
-        <w:br w:type="page"/>
-      </w:r>
+      <w:r/>
     </w:p>
     <w:p>
       <w:pPr>
         <w:pStyle w:val="Heading2"/>
       </w:pPr>
       <w:r>
-        <w:t>7. Implementation Status &amp; Executive Decision Addendum</w:t>
+        <w:t>7. Current Implementation Status &amp; Executive Decision Baseline (New on 15 July 2026)</w:t>
       </w:r>
     </w:p>
     <w:p>
@@ -1590,13 +2448,7 @@
     </w:p>
     <w:p>
       <w:r>
-        <w:rPr>
-          <w:b/>
-        </w:rPr>
-        <w:t xml:space="preserve">Authority note: </w:t>
-      </w:r>
-      <w:r>
-        <w:t>This addendum supersedes conflicting implementation assumptions in the original concept note. The assistant is policy-bound; it does not autonomously negotiate binding terms or declare a deal closed.</w:t>
+        <w:t>Control rule: Sections 1-6 preserve the original concept and historical intent. Where they conflict with this revision guide or Section 7, the 15 July 2026 baseline controls.</w:t>
       </w:r>
     </w:p>
     <w:p>
@@ -1610,33 +2462,49 @@
     <w:p>
       <w:pPr>
         <w:ind w:left="360" w:hanging="259"/>
-      </w:pPr>
-      <w:r>
-        <w:t>? Seven native-node N8N workflows cover authenticated ingress, conversation orchestration, outbound dispatch, provider status, UTC Follow-Up scheduling, Handoff dispatch, and operations.</w:t>
+        <w:numPr>
+          <w:ilvl w:val="0"/>
+          <w:numId w:val="1"/>
+        </w:numPr>
+      </w:pPr>
+      <w:r>
+        <w:t>Seven native-node N8N workflows cover authenticated ingress, conversation orchestration, outbound dispatch, provider status, UTC Follow-Up scheduling, Handoff dispatch, and operations.</w:t>
       </w:r>
     </w:p>
     <w:p>
       <w:pPr>
         <w:ind w:left="360" w:hanging="259"/>
-      </w:pPr>
-      <w:r>
-        <w:t>? PostgreSQL owns account-scoped business state, consent, Conversation ordering, policy/configuration versions, authorization, idempotency, retries, leases/claims, Handoffs, audit evidence, deletion minimization, and release activation.</w:t>
+        <w:numPr>
+          <w:ilvl w:val="0"/>
+          <w:numId w:val="1"/>
+        </w:numPr>
+      </w:pPr>
+      <w:r>
+        <w:t>PostgreSQL owns account-scoped business state, consent, Conversation ordering, policy/configuration versions, authorization, idempotency, retries, leases/claims, Handoffs, audit evidence, deletion minimization, and release activation.</w:t>
       </w:r>
     </w:p>
     <w:p>
       <w:pPr>
         <w:ind w:left="360" w:hanging="259"/>
-      </w:pPr>
-      <w:r>
-        <w:t>? Ten typed JSON contracts define the synthetic-local account, Product Knowledge, Sales Policy, model, qualification, consent/templates, retry, Handoff, retention, and Release Set inputs.</w:t>
+        <w:numPr>
+          <w:ilvl w:val="0"/>
+          <w:numId w:val="1"/>
+        </w:numPr>
+      </w:pPr>
+      <w:r>
+        <w:t>Ten typed JSON contracts define the synthetic-local account, Product Knowledge, Sales Policy, model, qualification, consent/templates, retry, Handoff, retention, and Release Set inputs.</w:t>
       </w:r>
     </w:p>
     <w:p>
       <w:pPr>
         <w:ind w:left="360" w:hanging="259"/>
-      </w:pPr>
-      <w:r>
-        <w:t>? A one-command harness provisions disposable credentials, applies the migration twice, imports and publishes all workflows, executes runtime and concurrency checks, verifies canonical export identity and secrets hygiene, and cleans generated plaintext and Docker volumes.</w:t>
+        <w:numPr>
+          <w:ilvl w:val="0"/>
+          <w:numId w:val="1"/>
+        </w:numPr>
+      </w:pPr>
+      <w:r>
+        <w:t>A one-command harness provisions disposable credentials, applies the migration twice, imports and publishes all workflows, executes runtime and concurrency checks, verifies canonical export identity and secrets hygiene, and cleans generated plaintext and Docker volumes.</w:t>
       </w:r>
     </w:p>
     <w:p>
@@ -1650,41 +2518,61 @@
     <w:p>
       <w:pPr>
         <w:ind w:left="360" w:hanging="259"/>
-      </w:pPr>
-      <w:r>
-        <w:t>? The LLM may draft language and propose typed intent; deterministic Sales Policy and human approval control price, discount, scope, SLA, warranty, contract terms, and other commercial commitments.</w:t>
+        <w:numPr>
+          <w:ilvl w:val="0"/>
+          <w:numId w:val="1"/>
+        </w:numPr>
+      </w:pPr>
+      <w:r>
+        <w:t>The LLM may draft language and propose typed intent; deterministic Sales Policy and human approval control price, discount, scope, SLA, warranty, contract terms, and other commercial commitments.</w:t>
       </w:r>
     </w:p>
     <w:p>
       <w:pPr>
         <w:ind w:left="360" w:hanging="259"/>
-      </w:pPr>
-      <w:r>
-        <w:t>? Customer buying intent produces ready_for_handoff. Only an authorized human or CRM may record approval or closed_won.</w:t>
+        <w:numPr>
+          <w:ilvl w:val="0"/>
+          <w:numId w:val="1"/>
+        </w:numPr>
+      </w:pPr>
+      <w:r>
+        <w:t>Customer buying intent produces ready_for_handoff. Only an authorized human or CRM may record approval or closed_won.</w:t>
       </w:r>
     </w:p>
     <w:p>
       <w:pPr>
         <w:ind w:left="360" w:hanging="259"/>
-      </w:pPr>
-      <w:r>
-        <w:t>? A customer may request a human at any stage. Human-Owned blocks automated replies and Follow-Ups; opt-out suppresses every pending customer-facing action.</w:t>
+        <w:numPr>
+          <w:ilvl w:val="0"/>
+          <w:numId w:val="1"/>
+        </w:numPr>
+      </w:pPr>
+      <w:r>
+        <w:t>A customer may request a human at any stage. Human-Owned blocks automated replies and Follow-Ups; opt-out suppresses every pending customer-facing action.</w:t>
       </w:r>
     </w:p>
     <w:p>
       <w:pPr>
         <w:ind w:left="360" w:hanging="259"/>
-      </w:pPr>
-      <w:r>
-        <w:t>? Follow-Ups use durable UTC jobs and recheck consent, opt-out, ownership, timing, frequency, campaign state, and WhatsApp template eligibility immediately before send.</w:t>
+        <w:numPr>
+          <w:ilvl w:val="0"/>
+          <w:numId w:val="1"/>
+        </w:numPr>
+      </w:pPr>
+      <w:r>
+        <w:t>Follow-Ups use durable UTC jobs and recheck consent, opt-out, ownership, timing, frequency, campaign state, and WhatsApp template eligibility immediately before send.</w:t>
       </w:r>
     </w:p>
     <w:p>
       <w:pPr>
         <w:ind w:left="360" w:hanging="259"/>
-      </w:pPr>
-      <w:r>
-        <w:t>? Internal Contact and Conversation IDs own scope and history; a phone number is a channel identifier, not sole identity authority.</w:t>
+        <w:numPr>
+          <w:ilvl w:val="0"/>
+          <w:numId w:val="1"/>
+        </w:numPr>
+      </w:pPr>
+      <w:r>
+        <w:t>Internal Contact and Conversation IDs own scope and history; a phone number is a channel identifier, not sole identity authority.</w:t>
       </w:r>
     </w:p>
     <w:p>
@@ -2016,41 +2904,61 @@
     <w:p>
       <w:pPr>
         <w:ind w:left="360" w:hanging="259"/>
-      </w:pPr>
-      <w:r>
-        <w:t>? README.md ? canonical local lifecycle and production gates.</w:t>
+        <w:numPr>
+          <w:ilvl w:val="0"/>
+          <w:numId w:val="1"/>
+        </w:numPr>
+      </w:pPr>
+      <w:r>
+        <w:t>README.md - canonical local lifecycle and production gates.</w:t>
       </w:r>
     </w:p>
     <w:p>
       <w:pPr>
         <w:ind w:left="360" w:hanging="259"/>
-      </w:pPr>
-      <w:r>
-        <w:t>? docs/index.md ? current brownfield documentation entry point.</w:t>
+        <w:numPr>
+          <w:ilvl w:val="0"/>
+          <w:numId w:val="1"/>
+        </w:numPr>
+      </w:pPr>
+      <w:r>
+        <w:t>docs/index.md - current brownfield documentation entry point.</w:t>
       </w:r>
     </w:p>
     <w:p>
       <w:pPr>
         <w:ind w:left="360" w:hanging="259"/>
-      </w:pPr>
-      <w:r>
-        <w:t>? _bmad-output/implementation-artifacts/test-evidence.md ? dated local verification result.</w:t>
+        <w:numPr>
+          <w:ilvl w:val="0"/>
+          <w:numId w:val="1"/>
+        </w:numPr>
+      </w:pPr>
+      <w:r>
+        <w:t>_bmad-output/implementation-artifacts/test-evidence.md - dated local verification result.</w:t>
       </w:r>
     </w:p>
     <w:p>
       <w:pPr>
         <w:ind w:left="360" w:hanging="259"/>
-      </w:pPr>
-      <w:r>
-        <w:t>? release/release-manifest.json ? pinned artifacts, hashes, native-node inventory, and disabled live-promotion flag.</w:t>
+        <w:numPr>
+          <w:ilvl w:val="0"/>
+          <w:numId w:val="1"/>
+        </w:numPr>
+      </w:pPr>
+      <w:r>
+        <w:t>release/release-manifest.json - pinned artifacts, hashes, native-node inventory, and disabled live-promotion flag.</w:t>
       </w:r>
     </w:p>
     <w:p>
       <w:pPr>
         <w:ind w:left="360" w:hanging="259"/>
-      </w:pPr>
-      <w:r>
-        <w:t>? _bmad-output/planning-artifacts/prds/prd-N8N-SalesFlow-AI-2026-07-14/prd.md ? canonical requirements and unresolved executive decisions.</w:t>
+        <w:numPr>
+          <w:ilvl w:val="0"/>
+          <w:numId w:val="1"/>
+        </w:numPr>
+      </w:pPr>
+      <w:r>
+        <w:t>_bmad-output/planning-artifacts/prds/prd-N8N-SalesFlow-AI-2026-07-14/prd.md - canonical requirements and unresolved executive decisions.</w:t>
       </w:r>
     </w:p>
     <w:sectPr>

</xml_diff>